<commit_message>
R4.5 rev. ANL: sin nodos sueltos, espectro recalibrado, 100 modos
- Se quitan los nodos 225-232 sin miembros (origen de los ~460 warnings
  de rigidez cero en el .ANL)
- Factores de SPECTRUM con el .ANL R4.5: X 1.1599 (antes 1.5377),
  Z 2.0938 (antes 2.7081); CUT OFF MODE SHAPE 100 porque Z quedo en
  89.745% con 50 modos
- EspectrosSismo y AreasTributarias con T, W dinamico y V SRSS del .ANL;
  V minimo como formula
- Peso y desglose con la participacion y factores nuevos

Co-Authored-By: Claude Opus 5.5 <noreply@anthropic.com>
Claude-Session: https://claude.ai/code/session_01DbpSpoM7qi5cJ9LMKpwgVv
</commit_message>
<xml_diff>
--- a/R4.5/DESGLOSE_PESO_NOSE_DOCK_H5_H6_R4.5.docx
+++ b/R4.5/DESGLOSE_PESO_NOSE_DOCK_H5_H6_R4.5.docx
@@ -462,7 +462,7 @@
                 <w:i w:val="0"/>
                 <w:sz w:val="17"/>
               </w:rPr>
-              <w:t>Modos utilizados</w:t>
+              <w:t>Modos (corrida R4.5) *</w:t>
             </w:r>
           </w:p>
         </w:tc>
@@ -525,7 +525,7 @@
                 <w:i w:val="0"/>
                 <w:sz w:val="17"/>
               </w:rPr>
-              <w:t>92.079 %</w:t>
+              <w:t>91.253 %</w:t>
             </w:r>
           </w:p>
         </w:tc>
@@ -569,7 +569,7 @@
                 <w:i w:val="0"/>
                 <w:sz w:val="17"/>
               </w:rPr>
-              <w:t>92.225 %</w:t>
+              <w:t>89.745 %</w:t>
             </w:r>
           </w:p>
         </w:tc>
@@ -634,7 +634,7 @@
                 <w:i w:val="0"/>
                 <w:sz w:val="17"/>
               </w:rPr>
-              <w:t>Factor espectro X *</w:t>
+              <w:t>Factor espectro X</w:t>
             </w:r>
           </w:p>
         </w:tc>
@@ -655,7 +655,7 @@
                 <w:i w:val="0"/>
                 <w:sz w:val="17"/>
               </w:rPr>
-              <w:t>1.5377</w:t>
+              <w:t>1.1599</w:t>
             </w:r>
           </w:p>
         </w:tc>
@@ -676,7 +676,7 @@
                 <w:i w:val="0"/>
                 <w:sz w:val="17"/>
               </w:rPr>
-              <w:t>Factor espectro Z *</w:t>
+              <w:t>Factor espectro Z</w:t>
             </w:r>
           </w:p>
         </w:tc>
@@ -697,7 +697,7 @@
                 <w:i w:val="0"/>
                 <w:sz w:val="17"/>
               </w:rPr>
-              <w:t>2.7081</w:t>
+              <w:t>2.0938</w:t>
             </w:r>
           </w:p>
         </w:tc>
@@ -801,7 +801,7 @@
           <w:i/>
           <w:sz w:val="16"/>
         </w:rPr>
-        <w:t>Peso de elementos: longitudes del modelo R4.5 × peso unitario de cada sección (mismo criterio que el STEEL MEMBER TAKE OFF de STAAD). Conexiones: 5 %. * Valores de la corrida R4.4: se actualizan al correr la R4.5 y recalibrar el espectro.</w:t>
+        <w:t>Peso de elementos: longitudes del modelo R4.5 × peso unitario de cada sección (mismo criterio que el STEEL MEMBER TAKE OFF de STAAD). Conexiones: 5 %. Factores del espectro recalibrados con el .ANL R4.5. * Corrida R4.5 con 50 modos: Z quedó en 89.745 % (&lt; 90 %), el .STD ya pide 100 modos.</w:t>
       </w:r>
     </w:p>
     <w:p>
@@ -876,18 +876,33 @@
           <w:i w:val="0"/>
           <w:sz w:val="17"/>
         </w:rPr>
-        <w:t>•  Se repuso el larguero 28 (eje A, nivel 4, Z = 0 a 2.50 m) que faltaba en la R4.4.</w:t>
+        <w:t>•  Se repuso el larguero 28 (eje A, nivel 4, Z = 0 a 2.50 m) que faltaba en la R4.4 y se quitaron los nodos sueltos 225 a 232 (warnings de rigidez cero).</w:t>
       </w:r>
     </w:p>
     <w:p>
       <w:pPr>
+        <w:spacing w:before="0" w:after="40"/>
+        <w:jc w:val="both"/>
+      </w:pPr>
+      <w:r>
+        <w:rPr>
+          <w:rFonts w:ascii="Arial" w:hAnsi="Arial" w:cs="Arial"/>
+          <w:b w:val="0"/>
+          <w:i w:val="0"/>
+          <w:sz w:val="17"/>
+        </w:rPr>
+        <w:t>•  Espectro NTDS recalibrado con el .ANL R4.5: factores X = 1.1599 y Z = 2.0938; CUT OFF MODE SHAPE 100.</w:t>
+      </w:r>
+    </w:p>
+    <w:p>
+      <w:pPr>
         <w:spacing w:after="0"/>
         <w:jc w:val="center"/>
       </w:pPr>
       <w:r>
         <w:drawing>
           <wp:inline xmlns:a="http://schemas.openxmlformats.org/drawingml/2006/main" xmlns:pic="http://schemas.openxmlformats.org/drawingml/2006/picture">
-            <wp:extent cx="4500000" cy="3234375"/>
+            <wp:extent cx="3780000" cy="2716875"/>
             <wp:docPr id="1" name="Picture 1"/>
             <wp:cNvGraphicFramePr>
               <a:graphicFrameLocks noChangeAspect="1"/>
@@ -908,7 +923,7 @@
                   <pic:spPr>
                     <a:xfrm>
                       <a:off x="0" y="0"/>
-                      <a:ext cx="4500000" cy="3234375"/>
+                      <a:ext cx="3780000" cy="2716875"/>
                     </a:xfrm>
                     <a:prstGeom prst="rect"/>
                   </pic:spPr>

</xml_diff>